<commit_message>
preparing for data publication
</commit_message>
<xml_diff>
--- a/publication/metadata_templates/abstract.docx
+++ b/publication/metadata_templates/abstract.docx
@@ -1,6 +1,6 @@
 
 <file path=word/document.xml><?xml version="1.0" encoding="utf-8"?>
-<w:document xmlns:wpc="http://schemas.microsoft.com/office/word/2010/wordprocessingCanvas" xmlns:cx="http://schemas.microsoft.com/office/drawing/2014/chartex" xmlns:cx1="http://schemas.microsoft.com/office/drawing/2015/9/8/chartex" xmlns:cx2="http://schemas.microsoft.com/office/drawing/2015/10/21/chartex" xmlns:cx3="http://schemas.microsoft.com/office/drawing/2016/5/9/chartex" xmlns:cx4="http://schemas.microsoft.com/office/drawing/2016/5/10/chartex" xmlns:cx5="http://schemas.microsoft.com/office/drawing/2016/5/11/chartex" xmlns:cx6="http://schemas.microsoft.com/office/drawing/2016/5/12/chartex" xmlns:cx7="http://schemas.microsoft.com/office/drawing/2016/5/13/chartex" xmlns:cx8="http://schemas.microsoft.com/office/drawing/2016/5/14/chartex" xmlns:mc="http://schemas.openxmlformats.org/markup-compatibility/2006" xmlns:aink="http://schemas.microsoft.com/office/drawing/2016/ink" xmlns:am3d="http://schemas.microsoft.com/office/drawing/2017/model3d" xmlns:o="urn:schemas-microsoft-com:office:office" xmlns:oel="http://schemas.microsoft.com/office/2019/extlst" xmlns:r="http://schemas.openxmlformats.org/officeDocument/2006/relationships" xmlns:m="http://schemas.openxmlformats.org/officeDocument/2006/math" xmlns:v="urn:schemas-microsoft-com:vml" xmlns:wp14="http://schemas.microsoft.com/office/word/2010/wordprocessingDrawing" xmlns:wp="http://schemas.openxmlformats.org/drawingml/2006/wordprocessingDrawing" xmlns:w10="urn:schemas-microsoft-com:office:word" xmlns:w="http://schemas.openxmlformats.org/wordprocessingml/2006/main" xmlns:w14="http://schemas.microsoft.com/office/word/2010/wordml" xmlns:w15="http://schemas.microsoft.com/office/word/2012/wordml" xmlns:w16cex="http://schemas.microsoft.com/office/word/2018/wordml/cex" xmlns:w16cid="http://schemas.microsoft.com/office/word/2016/wordml/cid" xmlns:w16="http://schemas.microsoft.com/office/word/2018/wordml" xmlns:w16du="http://schemas.microsoft.com/office/word/2023/wordml/word16du" xmlns:w16sdtdh="http://schemas.microsoft.com/office/word/2020/wordml/sdtdatahash" xmlns:w16se="http://schemas.microsoft.com/office/word/2015/wordml/symex" xmlns:wpg="http://schemas.microsoft.com/office/word/2010/wordprocessingGroup" xmlns:wpi="http://schemas.microsoft.com/office/word/2010/wordprocessingInk" xmlns:wne="http://schemas.microsoft.com/office/word/2006/wordml" xmlns:wps="http://schemas.microsoft.com/office/word/2010/wordprocessingShape" mc:Ignorable="w14 w15 w16se w16cid w16 w16cex w16sdtdh w16du wp14">
+<w:document xmlns:wpc="http://schemas.microsoft.com/office/word/2010/wordprocessingCanvas" xmlns:cx="http://schemas.microsoft.com/office/drawing/2014/chartex" xmlns:cx1="http://schemas.microsoft.com/office/drawing/2015/9/8/chartex" xmlns:cx2="http://schemas.microsoft.com/office/drawing/2015/10/21/chartex" xmlns:cx3="http://schemas.microsoft.com/office/drawing/2016/5/9/chartex" xmlns:cx4="http://schemas.microsoft.com/office/drawing/2016/5/10/chartex" xmlns:cx5="http://schemas.microsoft.com/office/drawing/2016/5/11/chartex" xmlns:cx6="http://schemas.microsoft.com/office/drawing/2016/5/12/chartex" xmlns:cx7="http://schemas.microsoft.com/office/drawing/2016/5/13/chartex" xmlns:cx8="http://schemas.microsoft.com/office/drawing/2016/5/14/chartex" xmlns:mc="http://schemas.openxmlformats.org/markup-compatibility/2006" xmlns:aink="http://schemas.microsoft.com/office/drawing/2016/ink" xmlns:am3d="http://schemas.microsoft.com/office/drawing/2017/model3d" xmlns:o="urn:schemas-microsoft-com:office:office" xmlns:oel="http://schemas.microsoft.com/office/2019/extlst" xmlns:r="http://schemas.openxmlformats.org/officeDocument/2006/relationships" xmlns:m="http://schemas.openxmlformats.org/officeDocument/2006/math" xmlns:v="urn:schemas-microsoft-com:vml" xmlns:wp14="http://schemas.microsoft.com/office/word/2010/wordprocessingDrawing" xmlns:wp="http://schemas.openxmlformats.org/drawingml/2006/wordprocessingDrawing" xmlns:w10="urn:schemas-microsoft-com:office:word" xmlns:w="http://schemas.openxmlformats.org/wordprocessingml/2006/main" xmlns:w14="http://schemas.microsoft.com/office/word/2010/wordml" xmlns:w15="http://schemas.microsoft.com/office/word/2012/wordml" xmlns:w16cex="http://schemas.microsoft.com/office/word/2018/wordml/cex" xmlns:w16cid="http://schemas.microsoft.com/office/word/2016/wordml/cid" xmlns:w16="http://schemas.microsoft.com/office/word/2018/wordml" xmlns:w16du="http://schemas.microsoft.com/office/word/2023/wordml/word16du" xmlns:w16sdtdh="http://schemas.microsoft.com/office/word/2020/wordml/sdtdatahash" xmlns:w16sdtfl="http://schemas.microsoft.com/office/word/2024/wordml/sdtformatlock" xmlns:w16se="http://schemas.microsoft.com/office/word/2015/wordml/symex" xmlns:wpg="http://schemas.microsoft.com/office/word/2010/wordprocessingGroup" xmlns:wpi="http://schemas.microsoft.com/office/word/2010/wordprocessingInk" xmlns:wne="http://schemas.microsoft.com/office/word/2006/wordml" xmlns:wps="http://schemas.microsoft.com/office/word/2010/wordprocessingShape" mc:Ignorable="w14 w15 w16se w16cid w16 w16cex w16sdtdh w16sdtfl w16du wp14">
   <w:body>
     <w:p>
       <w:pPr>
@@ -12,7 +12,19 @@
         <w:rPr>
           <w:rFonts w:ascii="Times New Roman" w:hAnsi="Times New Roman" w:cs="Times New Roman"/>
         </w:rPr>
-        <w:t xml:space="preserve">The San Francisco Estuary (SFE) is simultaneously a central hub of water delivery in California and home to commercially important and endangered fishes, such as Chinook Salmon, Green Sturgeon, and Delta and Longfin Smelt. Extensive ecological monitoring has been conducted for over 50 years, mainly under the auspices of the Interagency Ecological Program for the San Francisco Estuary (https://iep.ca.gov/). We integrated fish catch and length data from </w:t>
+        <w:t>The San Francisco Estuary (SFE) is simultaneously a central hub of water delivery in California and home to commercially</w:t>
+      </w:r>
+      <w:r>
+        <w:rPr>
+          <w:rFonts w:ascii="Times New Roman" w:hAnsi="Times New Roman" w:cs="Times New Roman"/>
+        </w:rPr>
+        <w:t xml:space="preserve"> and culturally</w:t>
+      </w:r>
+      <w:r>
+        <w:rPr>
+          <w:rFonts w:ascii="Times New Roman" w:hAnsi="Times New Roman" w:cs="Times New Roman"/>
+        </w:rPr>
+        <w:t xml:space="preserve"> important and endangered fishes, such as Chinook Salmon, Green Sturgeon, and Delta and Longfin Smelt. Extensive ecological monitoring has been conducted for over 50 years, mainly under the auspices of the Interagency Ecological Program for the San Francisco Estuary (https://iep.ca.gov/). We integrated fish catch and length data from </w:t>
       </w:r>
       <w:r>
         <w:rPr>
@@ -30,7 +42,7 @@
         <w:rPr>
           <w:rFonts w:ascii="Times New Roman" w:hAnsi="Times New Roman" w:cs="Times New Roman"/>
         </w:rPr>
-        <w:t>4</w:t>
+        <w:t>6</w:t>
       </w:r>
       <w:r>
         <w:rPr>
@@ -50,7 +62,7 @@
 </file>
 
 <file path=word/styles.xml><?xml version="1.0" encoding="utf-8"?>
-<w:styles xmlns:mc="http://schemas.openxmlformats.org/markup-compatibility/2006" xmlns:r="http://schemas.openxmlformats.org/officeDocument/2006/relationships" xmlns:w="http://schemas.openxmlformats.org/wordprocessingml/2006/main" xmlns:w14="http://schemas.microsoft.com/office/word/2010/wordml" xmlns:w15="http://schemas.microsoft.com/office/word/2012/wordml" xmlns:w16cex="http://schemas.microsoft.com/office/word/2018/wordml/cex" xmlns:w16cid="http://schemas.microsoft.com/office/word/2016/wordml/cid" xmlns:w16="http://schemas.microsoft.com/office/word/2018/wordml" xmlns:w16du="http://schemas.microsoft.com/office/word/2023/wordml/word16du" xmlns:w16sdtdh="http://schemas.microsoft.com/office/word/2020/wordml/sdtdatahash" xmlns:w16se="http://schemas.microsoft.com/office/word/2015/wordml/symex" mc:Ignorable="w14 w15 w16se w16cid w16 w16cex w16sdtdh w16du">
+<w:styles xmlns:mc="http://schemas.openxmlformats.org/markup-compatibility/2006" xmlns:r="http://schemas.openxmlformats.org/officeDocument/2006/relationships" xmlns:w="http://schemas.openxmlformats.org/wordprocessingml/2006/main" xmlns:w14="http://schemas.microsoft.com/office/word/2010/wordml" xmlns:w15="http://schemas.microsoft.com/office/word/2012/wordml" xmlns:w16cex="http://schemas.microsoft.com/office/word/2018/wordml/cex" xmlns:w16cid="http://schemas.microsoft.com/office/word/2016/wordml/cid" xmlns:w16="http://schemas.microsoft.com/office/word/2018/wordml" xmlns:w16du="http://schemas.microsoft.com/office/word/2023/wordml/word16du" xmlns:w16sdtdh="http://schemas.microsoft.com/office/word/2020/wordml/sdtdatahash" xmlns:w16sdtfl="http://schemas.microsoft.com/office/word/2024/wordml/sdtformatlock" xmlns:w16se="http://schemas.microsoft.com/office/word/2015/wordml/symex" mc:Ignorable="w14 w15 w16se w16cid w16 w16cex w16sdtdh w16sdtfl w16du">
   <w:docDefaults>
     <w:rPrDefault>
       <w:rPr>
@@ -783,4 +795,10 @@
   </a:objectDefaults>
   <a:extraClrSchemeLst/>
 </a:theme>
+</file>
+
+<file path=docMetadata/LabelInfo.xml><?xml version="1.0" encoding="utf-8"?>
+<clbl:labelList xmlns:clbl="http://schemas.microsoft.com/office/2020/mipLabelMetadata">
+  <clbl:label id="{0bb6ca0c-ccb3-428b-9d5f-a9c60cad6645}" enabled="1" method="Standard" siteId="{fe186a25-7d49-41e6-9941-05d2281d36c1}" contentBits="0" removed="0"/>
+</clbl:labelList>
 </file>
</xml_diff>